<commit_message>
docs(proposal): final QA pass — normalization fixes, 12 deliverables verified (EN/AR proposal, quotation, exec summary)
Co-Authored-By: Claude Fable 5 <noreply@anthropic.com>
</commit_message>
<xml_diff>
--- a/docs/proposals/live-quiz-platform/deliverables/Altanfith_LiveQuizPlatform_ExecSummary_AR_v1.0.docx
+++ b/docs/proposals/live-quiz-platform/deliverables/Altanfith_LiveQuizPlatform_ExecSummary_AR_v1.0.docx
@@ -117,6 +117,25 @@
                 <w:szCs w:val="18"/>
                 <w:rtl/>
               </w:rPr>
+              <w:t>مُقدَّم إلى: [اسم العميل]</w:t>
+            </w:r>
+            <w:r>
+              <w:rPr>
+                <w:rFonts w:ascii="Segoe UI" w:hAnsi="Segoe UI" w:cs="Segoe UI"/>
+                <w:color w:val="FFFFFF"/>
+                <w:sz w:val="18"/>
+                <w:szCs w:val="18"/>
+              </w:rPr>
+              <w:t xml:space="preserve">  ·  </w:t>
+            </w:r>
+            <w:r>
+              <w:rPr>
+                <w:rFonts w:ascii="Segoe UI" w:hAnsi="Segoe UI" w:cs="Segoe UI"/>
+                <w:color w:val="FFFFFF"/>
+                <w:sz w:val="18"/>
+                <w:szCs w:val="18"/>
+                <w:rtl/>
+              </w:rPr>
               <w:t>نظرة عامة فنية وتجارية</w:t>
             </w:r>
             <w:r>
@@ -213,7 +232,7 @@
           <w:rtl/>
           <w:lang w:bidi="ar"/>
         </w:rPr>
-        <w:t xml:space="preserve"> هي منصة مؤسسية للتفاعل والتقييم وقياس المعرفة — </w:t>
+        <w:t xml:space="preserve"> </w:t>
       </w:r>
       <w:r>
         <w:rPr>
@@ -224,7 +243,7 @@
           <w:rtl/>
           <w:lang w:bidi="ar"/>
         </w:rPr>
-        <w:t xml:space="preserve">بديل مرن وقابل للتخصيص عن أدوات المسابقات العامة مثل </w:t>
+        <w:t xml:space="preserve">هي منصة مؤسسية للتفاعل والتقييم وقياس المعرفة — بديل مرن وقابل للتخصيص عن أدوات المسابقات العامة مثل </w:t>
       </w:r>
       <w:r>
         <w:rPr>
@@ -2053,9 +2072,9 @@
 <file path=word/numbering.xml><?xml version="1.0" encoding="utf-8"?>
 <w:numbering xmlns:wpc="http://schemas.microsoft.com/office/word/2010/wordprocessingCanvas" xmlns:cx="http://schemas.microsoft.com/office/drawing/2014/chartex" xmlns:cx1="http://schemas.microsoft.com/office/drawing/2015/9/8/chartex" xmlns:cx2="http://schemas.microsoft.com/office/drawing/2015/10/21/chartex" xmlns:cx3="http://schemas.microsoft.com/office/drawing/2016/5/9/chartex" xmlns:cx4="http://schemas.microsoft.com/office/drawing/2016/5/10/chartex" xmlns:cx5="http://schemas.microsoft.com/office/drawing/2016/5/11/chartex" xmlns:cx6="http://schemas.microsoft.com/office/drawing/2016/5/12/chartex" xmlns:cx7="http://schemas.microsoft.com/office/drawing/2016/5/13/chartex" xmlns:cx8="http://schemas.microsoft.com/office/drawing/2016/5/14/chartex" xmlns:mc="http://schemas.openxmlformats.org/markup-compatibility/2006" xmlns:aink="http://schemas.microsoft.com/office/drawing/2016/ink" xmlns:am3d="http://schemas.microsoft.com/office/drawing/2017/model3d" xmlns:o="urn:schemas-microsoft-com:office:office" xmlns:oel="http://schemas.microsoft.com/office/2019/extlst" xmlns:r="http://schemas.openxmlformats.org/officeDocument/2006/relationships" xmlns:m="http://schemas.openxmlformats.org/officeDocument/2006/math" xmlns:v="urn:schemas-microsoft-com:vml" xmlns:wp14="http://schemas.microsoft.com/office/word/2010/wordprocessingDrawing" xmlns:wp="http://schemas.openxmlformats.org/drawingml/2006/wordprocessingDrawing" xmlns:w10="urn:schemas-microsoft-com:office:word" xmlns:w="http://schemas.openxmlformats.org/wordprocessingml/2006/main" xmlns:w14="http://schemas.microsoft.com/office/word/2010/wordml" xmlns:w15="http://schemas.microsoft.com/office/word/2012/wordml" xmlns:w16cex="http://schemas.microsoft.com/office/word/2018/wordml/cex" xmlns:w16cid="http://schemas.microsoft.com/office/word/2016/wordml/cid" xmlns:w16="http://schemas.microsoft.com/office/word/2018/wordml" xmlns:w16du="http://schemas.microsoft.com/office/word/2023/wordml/word16du" xmlns:w16sdtdh="http://schemas.microsoft.com/office/word/2020/wordml/sdtdatahash" xmlns:w16sdtfl="http://schemas.microsoft.com/office/word/2024/wordml/sdtformatlock" xmlns:w16se="http://schemas.microsoft.com/office/word/2015/wordml/symex" xmlns:wpg="http://schemas.microsoft.com/office/word/2010/wordprocessingGroup" xmlns:wpi="http://schemas.microsoft.com/office/word/2010/wordprocessingInk" xmlns:wne="http://schemas.microsoft.com/office/word/2006/wordml" xmlns:wps="http://schemas.microsoft.com/office/word/2010/wordprocessingShape" mc:Ignorable="w14 w15 w16se w16cid w16 w16cex w16sdtdh w16sdtfl w16du wp14">
   <w:abstractNum w:abstractNumId="0" w15:restartNumberingAfterBreak="0">
-    <w:nsid w:val="087C1B7A"/>
+    <w:nsid w:val="054C60C1"/>
     <w:multiLevelType w:val="multilevel"/>
-    <w:tmpl w:val="B4662336"/>
+    <w:tmpl w:val="1F74EB26"/>
     <w:lvl w:ilvl="0">
       <w:start w:val="1"/>
       <w:numFmt w:val="bullet"/>
@@ -2202,9 +2221,9 @@
     </w:lvl>
   </w:abstractNum>
   <w:abstractNum w:abstractNumId="1" w15:restartNumberingAfterBreak="0">
-    <w:nsid w:val="27162975"/>
+    <w:nsid w:val="24842787"/>
     <w:multiLevelType w:val="multilevel"/>
-    <w:tmpl w:val="3B601EB2"/>
+    <w:tmpl w:val="E6AAA3C0"/>
     <w:lvl w:ilvl="0">
       <w:start w:val="1"/>
       <w:numFmt w:val="bullet"/>
@@ -2351,9 +2370,9 @@
     </w:lvl>
   </w:abstractNum>
   <w:abstractNum w:abstractNumId="2" w15:restartNumberingAfterBreak="0">
-    <w:nsid w:val="66FF221A"/>
+    <w:nsid w:val="3A3F3FC0"/>
     <w:multiLevelType w:val="multilevel"/>
-    <w:tmpl w:val="9628FC26"/>
+    <w:tmpl w:val="ED521456"/>
     <w:lvl w:ilvl="0">
       <w:start w:val="1"/>
       <w:numFmt w:val="bullet"/>
@@ -2499,14 +2518,14 @@
       </w:rPr>
     </w:lvl>
   </w:abstractNum>
-  <w:num w:numId="1" w16cid:durableId="1719014921">
-    <w:abstractNumId w:val="2"/>
+  <w:num w:numId="1" w16cid:durableId="1192842979">
+    <w:abstractNumId w:val="1"/>
   </w:num>
-  <w:num w:numId="2" w16cid:durableId="392629012">
+  <w:num w:numId="2" w16cid:durableId="1250963977">
     <w:abstractNumId w:val="0"/>
   </w:num>
-  <w:num w:numId="3" w16cid:durableId="1904221357">
-    <w:abstractNumId w:val="1"/>
+  <w:num w:numId="3" w16cid:durableId="1105996465">
+    <w:abstractNumId w:val="2"/>
   </w:num>
 </w:numbering>
 </file>
@@ -3180,7 +3199,7 @@
     <w:link w:val="HeaderChar"/>
     <w:uiPriority w:val="99"/>
     <w:unhideWhenUsed/>
-    <w:rsid w:val="00BA701D"/>
+    <w:rsid w:val="008C6BD3"/>
     <w:pPr>
       <w:tabs>
         <w:tab w:val="center" w:pos="4680"/>
@@ -3193,7 +3212,7 @@
     <w:basedOn w:val="DefaultParagraphFont"/>
     <w:link w:val="Header"/>
     <w:uiPriority w:val="99"/>
-    <w:rsid w:val="00BA701D"/>
+    <w:rsid w:val="008C6BD3"/>
     <w:rPr>
       <w:rFonts w:eastAsiaTheme="minorEastAsia"/>
       <w:sz w:val="24"/>
@@ -3206,7 +3225,7 @@
     <w:link w:val="FooterChar"/>
     <w:uiPriority w:val="99"/>
     <w:unhideWhenUsed/>
-    <w:rsid w:val="00BA701D"/>
+    <w:rsid w:val="008C6BD3"/>
     <w:pPr>
       <w:tabs>
         <w:tab w:val="center" w:pos="4680"/>
@@ -3219,7 +3238,7 @@
     <w:basedOn w:val="DefaultParagraphFont"/>
     <w:link w:val="Footer"/>
     <w:uiPriority w:val="99"/>
-    <w:rsid w:val="00BA701D"/>
+    <w:rsid w:val="008C6BD3"/>
     <w:rPr>
       <w:rFonts w:eastAsiaTheme="minorEastAsia"/>
       <w:sz w:val="24"/>

</xml_diff>

<commit_message>
docs(proposal): final-review fixes — EN 34.1 renumber, drop Kahoot from summaries, wording/markup polish
docs-only change; gate ran green earlier this branch

Co-Authored-By: Claude Fable 5 <noreply@anthropic.com>
</commit_message>
<xml_diff>
--- a/docs/proposals/live-quiz-platform/deliverables/Altanfith_LiveQuizPlatform_ExecSummary_AR_v1.0.docx
+++ b/docs/proposals/live-quiz-platform/deliverables/Altanfith_LiveQuizPlatform_ExecSummary_AR_v1.0.docx
@@ -243,28 +243,7 @@
           <w:rtl/>
           <w:lang w:bidi="ar"/>
         </w:rPr>
-        <w:t xml:space="preserve">هي منصة مؤسسية للتفاعل والتقييم وقياس المعرفة — بديل مرن وقابل للتخصيص عن أدوات المسابقات العامة مثل </w:t>
-      </w:r>
-      <w:r>
-        <w:rPr>
-          <w:rFonts w:ascii="Segoe UI" w:hAnsi="Segoe UI" w:cs="Segoe UI"/>
-          <w:color w:val="1F2933"/>
-          <w:sz w:val="19"/>
-          <w:szCs w:val="19"/>
-          <w:lang w:bidi="ar"/>
-        </w:rPr>
-        <w:t>Kahoot</w:t>
-      </w:r>
-      <w:r>
-        <w:rPr>
-          <w:rFonts w:ascii="Segoe UI" w:hAnsi="Segoe UI" w:cs="Segoe UI"/>
-          <w:color w:val="1F2933"/>
-          <w:sz w:val="19"/>
-          <w:szCs w:val="19"/>
-          <w:rtl/>
-          <w:lang w:bidi="ar"/>
-        </w:rPr>
-        <w:t>، مصممة خصيصًا للاستخدام المؤسسي والحكومي. تدعم المنصة اجتماعات الصحة والسلامة والبيئة (</w:t>
+        <w:t>هي منصة مؤسسية للتفاعل والتقييم وقياس المعرفة — بديل مرن وقابل للتخصيص عن أدوات المسابقات العامة، مصممة خصيصًا للاستخدام المؤسسي والحكومي. تدعم المنصة اجتماعات الصحة والسلامة والبيئة (</w:t>
       </w:r>
       <w:r>
         <w:rPr>
@@ -1140,7 +1119,7 @@
                 <w:szCs w:val="18"/>
                 <w:rtl/>
               </w:rPr>
-              <w:t>وتحديد لمعدل الطلبات، مطوّرة مع مراعاة قائمة</w:t>
+              <w:t>وتحديد معدل الطلبات، مطوّرة مع مراعاة قائمة</w:t>
             </w:r>
             <w:r>
               <w:rPr>
@@ -2072,9 +2051,9 @@
 <file path=word/numbering.xml><?xml version="1.0" encoding="utf-8"?>
 <w:numbering xmlns:wpc="http://schemas.microsoft.com/office/word/2010/wordprocessingCanvas" xmlns:cx="http://schemas.microsoft.com/office/drawing/2014/chartex" xmlns:cx1="http://schemas.microsoft.com/office/drawing/2015/9/8/chartex" xmlns:cx2="http://schemas.microsoft.com/office/drawing/2015/10/21/chartex" xmlns:cx3="http://schemas.microsoft.com/office/drawing/2016/5/9/chartex" xmlns:cx4="http://schemas.microsoft.com/office/drawing/2016/5/10/chartex" xmlns:cx5="http://schemas.microsoft.com/office/drawing/2016/5/11/chartex" xmlns:cx6="http://schemas.microsoft.com/office/drawing/2016/5/12/chartex" xmlns:cx7="http://schemas.microsoft.com/office/drawing/2016/5/13/chartex" xmlns:cx8="http://schemas.microsoft.com/office/drawing/2016/5/14/chartex" xmlns:mc="http://schemas.openxmlformats.org/markup-compatibility/2006" xmlns:aink="http://schemas.microsoft.com/office/drawing/2016/ink" xmlns:am3d="http://schemas.microsoft.com/office/drawing/2017/model3d" xmlns:o="urn:schemas-microsoft-com:office:office" xmlns:oel="http://schemas.microsoft.com/office/2019/extlst" xmlns:r="http://schemas.openxmlformats.org/officeDocument/2006/relationships" xmlns:m="http://schemas.openxmlformats.org/officeDocument/2006/math" xmlns:v="urn:schemas-microsoft-com:vml" xmlns:wp14="http://schemas.microsoft.com/office/word/2010/wordprocessingDrawing" xmlns:wp="http://schemas.openxmlformats.org/drawingml/2006/wordprocessingDrawing" xmlns:w10="urn:schemas-microsoft-com:office:word" xmlns:w="http://schemas.openxmlformats.org/wordprocessingml/2006/main" xmlns:w14="http://schemas.microsoft.com/office/word/2010/wordml" xmlns:w15="http://schemas.microsoft.com/office/word/2012/wordml" xmlns:w16cex="http://schemas.microsoft.com/office/word/2018/wordml/cex" xmlns:w16cid="http://schemas.microsoft.com/office/word/2016/wordml/cid" xmlns:w16="http://schemas.microsoft.com/office/word/2018/wordml" xmlns:w16du="http://schemas.microsoft.com/office/word/2023/wordml/word16du" xmlns:w16sdtdh="http://schemas.microsoft.com/office/word/2020/wordml/sdtdatahash" xmlns:w16sdtfl="http://schemas.microsoft.com/office/word/2024/wordml/sdtformatlock" xmlns:w16se="http://schemas.microsoft.com/office/word/2015/wordml/symex" xmlns:wpg="http://schemas.microsoft.com/office/word/2010/wordprocessingGroup" xmlns:wpi="http://schemas.microsoft.com/office/word/2010/wordprocessingInk" xmlns:wne="http://schemas.microsoft.com/office/word/2006/wordml" xmlns:wps="http://schemas.microsoft.com/office/word/2010/wordprocessingShape" mc:Ignorable="w14 w15 w16se w16cid w16 w16cex w16sdtdh w16sdtfl w16du wp14">
   <w:abstractNum w:abstractNumId="0" w15:restartNumberingAfterBreak="0">
-    <w:nsid w:val="054C60C1"/>
+    <w:nsid w:val="39C047DD"/>
     <w:multiLevelType w:val="multilevel"/>
-    <w:tmpl w:val="1F74EB26"/>
+    <w:tmpl w:val="3BBAA9C0"/>
     <w:lvl w:ilvl="0">
       <w:start w:val="1"/>
       <w:numFmt w:val="bullet"/>
@@ -2221,9 +2200,9 @@
     </w:lvl>
   </w:abstractNum>
   <w:abstractNum w:abstractNumId="1" w15:restartNumberingAfterBreak="0">
-    <w:nsid w:val="24842787"/>
+    <w:nsid w:val="4A5E3044"/>
     <w:multiLevelType w:val="multilevel"/>
-    <w:tmpl w:val="E6AAA3C0"/>
+    <w:tmpl w:val="A22053BA"/>
     <w:lvl w:ilvl="0">
       <w:start w:val="1"/>
       <w:numFmt w:val="bullet"/>
@@ -2370,9 +2349,9 @@
     </w:lvl>
   </w:abstractNum>
   <w:abstractNum w:abstractNumId="2" w15:restartNumberingAfterBreak="0">
-    <w:nsid w:val="3A3F3FC0"/>
+    <w:nsid w:val="7319630E"/>
     <w:multiLevelType w:val="multilevel"/>
-    <w:tmpl w:val="ED521456"/>
+    <w:tmpl w:val="B0D6A576"/>
     <w:lvl w:ilvl="0">
       <w:start w:val="1"/>
       <w:numFmt w:val="bullet"/>
@@ -2518,14 +2497,14 @@
       </w:rPr>
     </w:lvl>
   </w:abstractNum>
-  <w:num w:numId="1" w16cid:durableId="1192842979">
+  <w:num w:numId="1" w16cid:durableId="788355744">
     <w:abstractNumId w:val="1"/>
   </w:num>
-  <w:num w:numId="2" w16cid:durableId="1250963977">
+  <w:num w:numId="2" w16cid:durableId="71633157">
+    <w:abstractNumId w:val="2"/>
+  </w:num>
+  <w:num w:numId="3" w16cid:durableId="1391155778">
     <w:abstractNumId w:val="0"/>
-  </w:num>
-  <w:num w:numId="3" w16cid:durableId="1105996465">
-    <w:abstractNumId w:val="2"/>
   </w:num>
 </w:numbering>
 </file>
@@ -3199,7 +3178,7 @@
     <w:link w:val="HeaderChar"/>
     <w:uiPriority w:val="99"/>
     <w:unhideWhenUsed/>
-    <w:rsid w:val="008C6BD3"/>
+    <w:rsid w:val="00C614CD"/>
     <w:pPr>
       <w:tabs>
         <w:tab w:val="center" w:pos="4680"/>
@@ -3212,7 +3191,7 @@
     <w:basedOn w:val="DefaultParagraphFont"/>
     <w:link w:val="Header"/>
     <w:uiPriority w:val="99"/>
-    <w:rsid w:val="008C6BD3"/>
+    <w:rsid w:val="00C614CD"/>
     <w:rPr>
       <w:rFonts w:eastAsiaTheme="minorEastAsia"/>
       <w:sz w:val="24"/>
@@ -3225,7 +3204,7 @@
     <w:link w:val="FooterChar"/>
     <w:uiPriority w:val="99"/>
     <w:unhideWhenUsed/>
-    <w:rsid w:val="008C6BD3"/>
+    <w:rsid w:val="00C614CD"/>
     <w:pPr>
       <w:tabs>
         <w:tab w:val="center" w:pos="4680"/>
@@ -3238,7 +3217,7 @@
     <w:basedOn w:val="DefaultParagraphFont"/>
     <w:link w:val="Footer"/>
     <w:uiPriority w:val="99"/>
-    <w:rsid w:val="008C6BD3"/>
+    <w:rsid w:val="00C614CD"/>
     <w:rPr>
       <w:rFonts w:eastAsiaTheme="minorEastAsia"/>
       <w:sz w:val="24"/>

</xml_diff>